<commit_message>
LOTS of ADA fixes...
</commit_message>
<xml_diff>
--- a/report_generation/ALT TEXT.docx
+++ b/report_generation/ALT TEXT.docx
@@ -69,13 +69,7 @@
     </w:p>
     <w:p>
       <w:r>
-        <w:t>A graph showing water transparency, epilimnetic phosphorus, and chlorophyll levels over time</w:t>
-      </w:r>
-      <w:r>
-        <w:t xml:space="preserve"> by year</w:t>
-      </w:r>
-      <w:r>
-        <w:t>.</w:t>
+        <w:t>A graph showing pH and conductivity levels in the upper water layer (epilimnion) over time by year.</w:t>
       </w:r>
     </w:p>
     <w:p>

</xml_diff>